<commit_message>
Updated the templates with the new image of the method steps.
</commit_message>
<xml_diff>
--- a/deliveries/cases/DE/3.docx
+++ b/deliveries/cases/DE/3.docx
@@ -6384,13 +6384,13 @@
       <w:r>
         <w:rPr>
           <w:noProof/>
-          <w:lang w:eastAsia="en-US"/>
+          <w:lang w:val="fr-BE" w:eastAsia="fr-BE"/>
         </w:rPr>
         <w:drawing>
-          <wp:inline distT="0" distB="0" distL="0" distR="0" wp14:anchorId="498FDE40" wp14:editId="2F4E1345">
-            <wp:extent cx="5086350" cy="4853214"/>
-            <wp:effectExtent l="0" t="0" r="0" b="5080"/>
-            <wp:docPr id="3" name="Picture 3"/>
+          <wp:inline distT="0" distB="0" distL="0" distR="0" wp14:anchorId="1AB2D20D" wp14:editId="054858EF">
+            <wp:extent cx="4947684" cy="4610366"/>
+            <wp:effectExtent l="0" t="0" r="5715" b="0"/>
+            <wp:docPr id="1525512726" name="Picture 1"/>
             <wp:cNvGraphicFramePr>
               <a:graphicFrameLocks xmlns:a="http://schemas.openxmlformats.org/drawingml/2006/main" noChangeAspect="1"/>
             </wp:cNvGraphicFramePr>
@@ -6398,7 +6398,7 @@
               <a:graphicData uri="http://schemas.openxmlformats.org/drawingml/2006/picture">
                 <pic:pic xmlns:pic="http://schemas.openxmlformats.org/drawingml/2006/picture">
                   <pic:nvPicPr>
-                    <pic:cNvPr id="1" name=""/>
+                    <pic:cNvPr id="1525512726" name=""/>
                     <pic:cNvPicPr/>
                   </pic:nvPicPr>
                   <pic:blipFill>
@@ -6410,7 +6410,7 @@
                   <pic:spPr>
                     <a:xfrm>
                       <a:off x="0" y="0"/>
-                      <a:ext cx="5136675" cy="4901232"/>
+                      <a:ext cx="5036287" cy="4692928"/>
                     </a:xfrm>
                     <a:prstGeom prst="rect">
                       <a:avLst/>
@@ -9523,8 +9523,8 @@
       </w:pPr>
       <w:bookmarkStart w:id="23" w:name="_Toc450917900"/>
       <w:bookmarkStart w:id="24" w:name="_Toc511640591"/>
-      <w:bookmarkStart w:id="25" w:name="_Toc354489473"/>
-      <w:bookmarkStart w:id="26" w:name="_Toc230371389"/>
+      <w:bookmarkStart w:id="25" w:name="_Toc230371389"/>
+      <w:bookmarkStart w:id="26" w:name="_Toc354489473"/>
       <w:proofErr w:type="spellStart"/>
       <w:r>
         <w:t>Beschreibung</w:t>
@@ -9539,15 +9539,15 @@
       </w:r>
       <w:bookmarkEnd w:id="23"/>
       <w:bookmarkEnd w:id="24"/>
+      <w:bookmarkEnd w:id="25"/>
+      <w:proofErr w:type="spellEnd"/>
+      <w:r>
+        <w:rPr>
+          <w:lang w:val="fr-LU"/>
+        </w:rPr>
+        <w:t xml:space="preserve"> </w:t>
+      </w:r>
       <w:bookmarkEnd w:id="26"/>
-      <w:proofErr w:type="spellEnd"/>
-      <w:r>
-        <w:rPr>
-          <w:lang w:val="fr-LU"/>
-        </w:rPr>
-        <w:t xml:space="preserve"> </w:t>
-      </w:r>
-      <w:bookmarkEnd w:id="25"/>
     </w:p>
     <w:p>
       <w:pPr>
@@ -9558,12 +9558,12 @@
         </w:numPr>
         <w:ind w:left="709"/>
       </w:pPr>
-      <w:bookmarkStart w:id="27" w:name="_Toc354489474"/>
-      <w:bookmarkStart w:id="28" w:name="_Toc450917901"/>
-      <w:bookmarkStart w:id="29" w:name="_Toc511640592"/>
-      <w:bookmarkStart w:id="30" w:name="_Toc230360230"/>
-      <w:bookmarkStart w:id="31" w:name="_Toc230360701"/>
-      <w:bookmarkStart w:id="32" w:name="_Toc230371390"/>
+      <w:bookmarkStart w:id="27" w:name="_Toc230360230"/>
+      <w:bookmarkStart w:id="28" w:name="_Toc230360701"/>
+      <w:bookmarkStart w:id="29" w:name="_Toc230371390"/>
+      <w:bookmarkStart w:id="30" w:name="_Toc354489474"/>
+      <w:bookmarkStart w:id="31" w:name="_Toc450917901"/>
+      <w:bookmarkStart w:id="32" w:name="_Toc511640592"/>
       <w:proofErr w:type="spellStart"/>
       <w:r>
         <w:t>Kontext</w:t>
@@ -9576,9 +9576,9 @@
       <w:r>
         <w:t>Risikoanalyse</w:t>
       </w:r>
-      <w:bookmarkEnd w:id="30"/>
-      <w:bookmarkEnd w:id="31"/>
-      <w:bookmarkEnd w:id="32"/>
+      <w:bookmarkEnd w:id="27"/>
+      <w:bookmarkEnd w:id="28"/>
+      <w:bookmarkEnd w:id="29"/>
       <w:proofErr w:type="spellEnd"/>
     </w:p>
     <w:p>
@@ -9656,9 +9656,9 @@
       <w:r>
         <w:t>Risikobewertung</w:t>
       </w:r>
-      <w:bookmarkEnd w:id="27"/>
-      <w:bookmarkEnd w:id="28"/>
-      <w:bookmarkEnd w:id="29"/>
+      <w:bookmarkEnd w:id="30"/>
+      <w:bookmarkEnd w:id="31"/>
+      <w:bookmarkEnd w:id="32"/>
       <w:bookmarkEnd w:id="36"/>
       <w:proofErr w:type="spellEnd"/>
     </w:p>
@@ -12598,10 +12598,10 @@
       </w:pPr>
       <w:bookmarkStart w:id="79" w:name="_Toc450917913"/>
       <w:bookmarkStart w:id="80" w:name="_Toc511640603"/>
-      <w:bookmarkStart w:id="81" w:name="_Toc360469787"/>
-      <w:bookmarkStart w:id="82" w:name="_Ref415751951"/>
-      <w:bookmarkStart w:id="83" w:name="_Ref415751961"/>
-      <w:bookmarkStart w:id="84" w:name="_Toc230371409"/>
+      <w:bookmarkStart w:id="81" w:name="_Toc230371409"/>
+      <w:bookmarkStart w:id="82" w:name="_Toc360469787"/>
+      <w:bookmarkStart w:id="83" w:name="_Ref415751951"/>
+      <w:bookmarkStart w:id="84" w:name="_Ref415751961"/>
       <w:proofErr w:type="spellStart"/>
       <w:r>
         <w:t>Zusammenfassung</w:t>
@@ -12616,12 +12616,12 @@
       </w:r>
       <w:bookmarkEnd w:id="79"/>
       <w:bookmarkEnd w:id="80"/>
-      <w:bookmarkEnd w:id="84"/>
+      <w:bookmarkEnd w:id="81"/>
       <w:proofErr w:type="spellEnd"/>
     </w:p>
-    <w:bookmarkEnd w:id="81"/>
     <w:bookmarkEnd w:id="82"/>
     <w:bookmarkEnd w:id="83"/>
+    <w:bookmarkEnd w:id="84"/>
     <w:p>
       <w:pPr>
         <w:spacing w:after="0"/>
@@ -22046,7 +22046,7 @@
 </file>
 
 <file path=customXml/itemProps1.xml><?xml version="1.0" encoding="utf-8"?>
-<ds:datastoreItem xmlns:ds="http://schemas.openxmlformats.org/officeDocument/2006/customXml" ds:itemID="{E97BF506-FB34-4DD8-B8CF-6979D7DE7A9E}">
+<ds:datastoreItem xmlns:ds="http://schemas.openxmlformats.org/officeDocument/2006/customXml" ds:itemID="{55F9EED0-5F36-4CE5-9675-7966208CB1C6}">
   <ds:schemaRefs>
     <ds:schemaRef ds:uri="http://schemas.openxmlformats.org/officeDocument/2006/bibliography"/>
   </ds:schemaRefs>
@@ -22054,7 +22054,7 @@
 </file>
 
 <file path=customXml/itemProps2.xml><?xml version="1.0" encoding="utf-8"?>
-<ds:datastoreItem xmlns:ds="http://schemas.openxmlformats.org/officeDocument/2006/customXml" ds:itemID="{55F9EED0-5F36-4CE5-9675-7966208CB1C6}">
+<ds:datastoreItem xmlns:ds="http://schemas.openxmlformats.org/officeDocument/2006/customXml" ds:itemID="{E97BF506-FB34-4DD8-B8CF-6979D7DE7A9E}">
   <ds:schemaRefs>
     <ds:schemaRef ds:uri="http://schemas.openxmlformats.org/officeDocument/2006/bibliography"/>
   </ds:schemaRefs>

</xml_diff>